<commit_message>
Drop Q31 (regretted fundraiser) and Q32 (max price) per Michael
Reflection section now down to 3 questions:
  30. Which fundraiser made the MOST money? (game-proof)
  31. Game costs vs expected reality + gym fallback plan
  32. Real grade affordability + action plan

Cleaner, more focused. Both dropped Qs were called pointless —
"regretted fundraiser" duplicated info already in Part 2 (your
playthrough) and "max price seniors would pay" was too speculative.

Answer key trimmed to match. Docx + pdf regenerated.

Co-Authored-By: Claude Opus 4.6 <noreply@anthropic.com>
</commit_message>
<xml_diff>
--- a/worksheet.docx
+++ b/worksheet.docx
@@ -1311,7 +1311,7 @@
         <w:rPr>
           <w:sz w:val="20"/>
         </w:rPr>
-        <w:t>31. Describe a fundraiser you regret — one that lost money, got cancelled, or you skipped. What happened?</w:t>
+        <w:t>31. How well did the game’s prom and Senior Package costs match what you’d EXPECTED them to cost in real life? Do you plan on holding your real prom in the gym (like many do in the game) to make the numbers work?</w:t>
       </w:r>
     </w:p>
     <w:p>
@@ -1347,79 +1347,7 @@
         <w:rPr>
           <w:sz w:val="20"/>
         </w:rPr>
-        <w:t>32. What’s the MAX you think a senior would realistically pay for the Senior Package? Would your classmates have actually paid the price YOU set in the game?</w:t>
-      </w:r>
-    </w:p>
-    <w:p>
-      <w:pPr>
-        <w:spacing w:after="40"/>
-        <w:ind w:left="432"/>
-      </w:pPr>
-      <w:r>
-        <w:rPr>
-          <w:sz w:val="20"/>
-        </w:rPr>
-        <w:t>________________________________________________________________________________</w:t>
-      </w:r>
-    </w:p>
-    <w:p>
-      <w:pPr>
-        <w:spacing w:after="40"/>
-        <w:ind w:left="432"/>
-      </w:pPr>
-      <w:r>
-        <w:rPr>
-          <w:sz w:val="20"/>
-        </w:rPr>
-        <w:t>________________________________________________________________________________</w:t>
-      </w:r>
-    </w:p>
-    <w:p>
-      <w:pPr>
-        <w:spacing w:after="40"/>
-        <w:ind w:left="288"/>
-      </w:pPr>
-      <w:r>
-        <w:rPr>
-          <w:sz w:val="20"/>
-        </w:rPr>
-        <w:t>33. How well did the game’s prom and Senior Package costs match what you’d EXPECTED them to cost in real life? Do you plan on holding your real prom in the gym (like many do in the game) to make the numbers work?</w:t>
-      </w:r>
-    </w:p>
-    <w:p>
-      <w:pPr>
-        <w:spacing w:after="40"/>
-        <w:ind w:left="432"/>
-      </w:pPr>
-      <w:r>
-        <w:rPr>
-          <w:sz w:val="20"/>
-        </w:rPr>
-        <w:t>________________________________________________________________________________</w:t>
-      </w:r>
-    </w:p>
-    <w:p>
-      <w:pPr>
-        <w:spacing w:after="40"/>
-        <w:ind w:left="432"/>
-      </w:pPr>
-      <w:r>
-        <w:rPr>
-          <w:sz w:val="20"/>
-        </w:rPr>
-        <w:t>________________________________________________________________________________</w:t>
-      </w:r>
-    </w:p>
-    <w:p>
-      <w:pPr>
-        <w:spacing w:after="40"/>
-        <w:ind w:left="288"/>
-      </w:pPr>
-      <w:r>
-        <w:rPr>
-          <w:sz w:val="20"/>
-        </w:rPr>
-        <w:t>34. How close is YOUR REAL grade to affording the prom + Senior Package you’d actually want? If there’s a gap — what’s your plan to close it?</w:t>
+        <w:t>32. How close is YOUR REAL grade to affording the prom + Senior Package you’d actually want? If there’s a gap — what’s your plan to close it?</w:t>
       </w:r>
     </w:p>
     <w:p>

</xml_diff>